<commit_message>
Integración completa de señales Vía 2, corrección de errores en generación de informes Word y optimización de visualización dual de vías
</commit_message>
<xml_diff>
--- a/pk's señales.docx
+++ b/pk's señales.docx
@@ -550,6 +550,519 @@
       <w:proofErr w:type="spellEnd"/>
       <w:r>
         <w:t xml:space="preserve"> de las señales 907, 909, 919 y 913 reflejan valores cercanos a Sant Cugat (15.3xx) debido a la configuración de las agujas de entrada al ramal.</w:t>
+      </w:r>
+    </w:p>
+    <w:p/>
+    <w:p>
+      <w:r>
+        <w:t xml:space="preserve">Aquí tienes el listado completo para la Vía 2 (sentido Barcelona), con el número de señal y su PK absoluto calculado desde </w:t>
+      </w:r>
+      <w:proofErr w:type="spellStart"/>
+      <w:r>
+        <w:t>Plaça</w:t>
+      </w:r>
+      <w:proofErr w:type="spellEnd"/>
+      <w:r>
+        <w:t xml:space="preserve"> Catalunya (0.000).</w:t>
+      </w:r>
+    </w:p>
+    <w:p>
+      <w:r>
+        <w:t>Al igual que con la Vía 1, he aplicado la lógica de progresión acumulativa sobre los puntos de bifurcación (Gràcia 2.050, Sarrià 4.610 y Sant Cugat 15.310) para obtener la distancia real.</w:t>
+      </w:r>
+    </w:p>
+    <w:p>
+      <w:r>
+        <w:rPr>
+          <w:rFonts w:ascii="Apple Color Emoji" w:hAnsi="Apple Color Emoji" w:cs="Apple Color Emoji"/>
+        </w:rPr>
+        <w:t>📍</w:t>
+      </w:r>
+      <w:r>
+        <w:t xml:space="preserve"> Tronco Común y Ramal L7 (Entrada a Barcelona)</w:t>
+      </w:r>
+    </w:p>
+    <w:p>
+      <w:r>
+        <w:t>Señales de entrada al núcleo urbano.</w:t>
+      </w:r>
+    </w:p>
+    <w:p>
+      <w:r>
+        <w:t>| Señal Vía 2 | PK Absoluto | Línea(s) |</w:t>
+      </w:r>
+    </w:p>
+    <w:p>
+      <w:r>
+        <w:t>|---|---|---|</w:t>
+      </w:r>
+    </w:p>
+    <w:p>
+      <w:r>
+        <w:t>| 116 | 0.250 | Todas |</w:t>
+      </w:r>
+    </w:p>
+    <w:p>
+      <w:r>
+        <w:t>| 112 | 0.340 | Todas |</w:t>
+      </w:r>
+    </w:p>
+    <w:p>
+      <w:r>
+        <w:t>| 110 | 0.604 | Todas |</w:t>
+      </w:r>
+    </w:p>
+    <w:p>
+      <w:r>
+        <w:t>| 108 | 0.953 | Todas |</w:t>
+      </w:r>
+    </w:p>
+    <w:p>
+      <w:r>
+        <w:t>| 104 | 1.151 | Todas |</w:t>
+      </w:r>
+    </w:p>
+    <w:p>
+      <w:r>
+        <w:t>| 102 | 1.387 | Todas |</w:t>
+      </w:r>
+    </w:p>
+    <w:p>
+      <w:r>
+        <w:t>| 224 | 1.805 | Todas |</w:t>
+      </w:r>
+    </w:p>
+    <w:p>
+      <w:r>
+        <w:t>| 216 | 2.032 | L7 |</w:t>
+      </w:r>
+    </w:p>
+    <w:p>
+      <w:r>
+        <w:t>| 236 | 2.109 | L7 |</w:t>
+      </w:r>
+    </w:p>
+    <w:p>
+      <w:r>
+        <w:t>| 234 | 2.610 | L7 |</w:t>
+      </w:r>
+    </w:p>
+    <w:p>
+      <w:r>
+        <w:t>| 232 | 3.002 | L7 |</w:t>
+      </w:r>
+    </w:p>
+    <w:p>
+      <w:r>
+        <w:t>| 230 | 3.807 | L7 |</w:t>
+      </w:r>
+    </w:p>
+    <w:p>
+      <w:r>
+        <w:t>| 218 | 2.008 | S1, S2 |</w:t>
+      </w:r>
+    </w:p>
+    <w:p>
+      <w:r>
+        <w:t>| 214 | 2.113 | S1, S2 |</w:t>
+      </w:r>
+    </w:p>
+    <w:p>
+      <w:r>
+        <w:t>| 210 | 2.218 | S1, S2 |</w:t>
+      </w:r>
+    </w:p>
+    <w:p>
+      <w:r>
+        <w:t>| 208 | 2.552 | S1, S2 |</w:t>
+      </w:r>
+    </w:p>
+    <w:p>
+      <w:r>
+        <w:t>| 206 | 2.854 | S1, S2 |</w:t>
+      </w:r>
+    </w:p>
+    <w:p>
+      <w:r>
+        <w:t>| 202 | 3.031 | S1, S2 |</w:t>
+      </w:r>
+    </w:p>
+    <w:p>
+      <w:r>
+        <w:rPr>
+          <w:rFonts w:ascii="Apple Color Emoji" w:hAnsi="Apple Color Emoji" w:cs="Apple Color Emoji"/>
+        </w:rPr>
+        <w:t>🏔️</w:t>
+      </w:r>
+      <w:r>
+        <w:t xml:space="preserve"> Tronco Vallès (Común S1 y S2 - Vía 2)</w:t>
+      </w:r>
+    </w:p>
+    <w:p>
+      <w:r>
+        <w:t>Descenso desde Sant Cugat hacia Sarrià.</w:t>
+      </w:r>
+    </w:p>
+    <w:p>
+      <w:r>
+        <w:t>| Señal Vía 2 | PK Absoluto |</w:t>
+      </w:r>
+    </w:p>
+    <w:p>
+      <w:r>
+        <w:t>|---|---|</w:t>
+      </w:r>
+    </w:p>
+    <w:p>
+      <w:r>
+        <w:t>| 342 | 3.321 |</w:t>
+      </w:r>
+    </w:p>
+    <w:p>
+      <w:r>
+        <w:t>| 338 | 3.554 |</w:t>
+      </w:r>
+    </w:p>
+    <w:p>
+      <w:r>
+        <w:t>| 336 | 3.787 |</w:t>
+      </w:r>
+    </w:p>
+    <w:p>
+      <w:r>
+        <w:t>| 334 | 4.033 |</w:t>
+      </w:r>
+    </w:p>
+    <w:p>
+      <w:r>
+        <w:t>| 328 | 4.493 |</w:t>
+      </w:r>
+    </w:p>
+    <w:p>
+      <w:r>
+        <w:t>| 350 | 4.708 |</w:t>
+      </w:r>
+    </w:p>
+    <w:p>
+      <w:r>
+        <w:t>| 310 | 5.153 |</w:t>
+      </w:r>
+    </w:p>
+    <w:p>
+      <w:r>
+        <w:t>| 306 | 5.985 |</w:t>
+      </w:r>
+    </w:p>
+    <w:p>
+      <w:r>
+        <w:t>| 302 | 6.635 |</w:t>
+      </w:r>
+    </w:p>
+    <w:p>
+      <w:r>
+        <w:t>| 26b | 7.269 |</w:t>
+      </w:r>
+    </w:p>
+    <w:p>
+      <w:r>
+        <w:t>| 26 | 8.333 |</w:t>
+      </w:r>
+    </w:p>
+    <w:p>
+      <w:r>
+        <w:t>| 412 | 9.243 |</w:t>
+      </w:r>
+    </w:p>
+    <w:p>
+      <w:r>
+        <w:t>| 404 | 9.979 |</w:t>
+      </w:r>
+    </w:p>
+    <w:p>
+      <w:r>
+        <w:t>| 402 | 11.037 |</w:t>
+      </w:r>
+    </w:p>
+    <w:p>
+      <w:r>
+        <w:t>| 456 | 12.160 |</w:t>
+      </w:r>
+    </w:p>
+    <w:p>
+      <w:r>
+        <w:t>| 454 | 13.054 |</w:t>
+      </w:r>
+    </w:p>
+    <w:p>
+      <w:r>
+        <w:t>| 452 | 13.851 |</w:t>
+      </w:r>
+    </w:p>
+    <w:p>
+      <w:r>
+        <w:t>| 38b | 14.506 |</w:t>
+      </w:r>
+    </w:p>
+    <w:p>
+      <w:r>
+        <w:t>| 38 | 15.260 |</w:t>
+      </w:r>
+    </w:p>
+    <w:p>
+      <w:r>
+        <w:rPr>
+          <w:rFonts w:ascii="Apple Color Emoji" w:hAnsi="Apple Color Emoji" w:cs="Apple Color Emoji"/>
+        </w:rPr>
+        <w:t>🏁</w:t>
+      </w:r>
+      <w:r>
+        <w:t xml:space="preserve"> Ramal S1 (Desde Terrassa - Vía 2)</w:t>
+      </w:r>
+    </w:p>
+    <w:p>
+      <w:r>
+        <w:t>| Señal Vía 2 | PK Absoluto |</w:t>
+      </w:r>
+    </w:p>
+    <w:p>
+      <w:r>
+        <w:t>|---|---|</w:t>
+      </w:r>
+    </w:p>
+    <w:p>
+      <w:r>
+        <w:t>| 512 | 21.609 |</w:t>
+      </w:r>
+    </w:p>
+    <w:p>
+      <w:r>
+        <w:t>| 502/E | 21.967 |</w:t>
+      </w:r>
+    </w:p>
+    <w:p>
+      <w:r>
+        <w:t>| 506 | 22.781 |</w:t>
+      </w:r>
+    </w:p>
+    <w:p>
+      <w:r>
+        <w:t>| 624 | 24.283 |</w:t>
+      </w:r>
+    </w:p>
+    <w:p>
+      <w:r>
+        <w:t>| 620 | 25.262 |</w:t>
+      </w:r>
+    </w:p>
+    <w:p>
+      <w:r>
+        <w:t>| 614/s | 26.041 |</w:t>
+      </w:r>
+    </w:p>
+    <w:p>
+      <w:r>
+        <w:t>| 612/M | 26.446 |</w:t>
+      </w:r>
+    </w:p>
+    <w:p>
+      <w:r>
+        <w:t>| 608/E | 26.608 |</w:t>
+      </w:r>
+    </w:p>
+    <w:p>
+      <w:r>
+        <w:t>| 604/E | 27.326 |</w:t>
+      </w:r>
+    </w:p>
+    <w:p>
+      <w:r>
+        <w:t>| 602 | 28.013 |</w:t>
+      </w:r>
+    </w:p>
+    <w:p>
+      <w:r>
+        <w:t>| 704/S | 30.350 |</w:t>
+      </w:r>
+    </w:p>
+    <w:p>
+      <w:r>
+        <w:t>| 708/E | 31.706 |</w:t>
+      </w:r>
+    </w:p>
+    <w:p>
+      <w:r>
+        <w:t>| 710 | 33.311 |</w:t>
+      </w:r>
+    </w:p>
+    <w:p>
+      <w:r>
+        <w:t>| 816 | 35.356 |</w:t>
+      </w:r>
+    </w:p>
+    <w:p>
+      <w:r>
+        <w:t>| 810 | 35.734 |</w:t>
+      </w:r>
+    </w:p>
+    <w:p>
+      <w:r>
+        <w:t>| 806 | 36.180 |</w:t>
+      </w:r>
+    </w:p>
+    <w:p>
+      <w:r>
+        <w:t>| 802 | 36.940 |</w:t>
+      </w:r>
+    </w:p>
+    <w:p>
+      <w:r>
+        <w:t>| 1126 | 37.398 |</w:t>
+      </w:r>
+    </w:p>
+    <w:p>
+      <w:r>
+        <w:t>| 1122 | 37.841 |</w:t>
+      </w:r>
+    </w:p>
+    <w:p>
+      <w:r>
+        <w:t>| 1118 | 38.421 |</w:t>
+      </w:r>
+    </w:p>
+    <w:p>
+      <w:r>
+        <w:t>| 1114 | 39.073 |</w:t>
+      </w:r>
+    </w:p>
+    <w:p>
+      <w:r>
+        <w:t>| 1110 | 39.255 |</w:t>
+      </w:r>
+    </w:p>
+    <w:p>
+      <w:r>
+        <w:rPr>
+          <w:rFonts w:ascii="Apple Color Emoji" w:hAnsi="Apple Color Emoji" w:cs="Apple Color Emoji"/>
+        </w:rPr>
+        <w:t>🏁</w:t>
+      </w:r>
+      <w:r>
+        <w:t xml:space="preserve"> Ramal S2 (Desde Sabadell - Vía 2)</w:t>
+      </w:r>
+    </w:p>
+    <w:p>
+      <w:r>
+        <w:t>| Señal Vía 2 | PK Absoluto |</w:t>
+      </w:r>
+    </w:p>
+    <w:p>
+      <w:r>
+        <w:t>|---|---|</w:t>
+      </w:r>
+    </w:p>
+    <w:p>
+      <w:r>
+        <w:t>| 528 | 15.468 |</w:t>
+      </w:r>
+    </w:p>
+    <w:p>
+      <w:r>
+        <w:t>| 524 | 15.620 |</w:t>
+      </w:r>
+    </w:p>
+    <w:p>
+      <w:r>
+        <w:t>| 402/E2 | 15.888 |</w:t>
+      </w:r>
+    </w:p>
+    <w:p>
+      <w:r>
+        <w:t>| 1112 | 16.728 |</w:t>
+      </w:r>
+    </w:p>
+    <w:p>
+      <w:r>
+        <w:t>| 1106 | 17.224 |</w:t>
+      </w:r>
+    </w:p>
+    <w:p>
+      <w:r>
+        <w:t>| 1102 | 17.910 |</w:t>
+      </w:r>
+    </w:p>
+    <w:p>
+      <w:r>
+        <w:t>| 914 | 19.622 |</w:t>
+      </w:r>
+    </w:p>
+    <w:p>
+      <w:r>
+        <w:t>| 910 | 16.518 |</w:t>
+      </w:r>
+    </w:p>
+    <w:p>
+      <w:r>
+        <w:t>| 904 | 17.307 |</w:t>
+      </w:r>
+    </w:p>
+    <w:p>
+      <w:r>
+        <w:t>| 902 | 23.015 |</w:t>
+      </w:r>
+    </w:p>
+    <w:p>
+      <w:r>
+        <w:t>| 1002 | 23.435 |</w:t>
+      </w:r>
+    </w:p>
+    <w:p>
+      <w:r>
+        <w:t>| 1024 | 24.230 |</w:t>
+      </w:r>
+    </w:p>
+    <w:p>
+      <w:r>
+        <w:t>| 1020 | 24.740 |</w:t>
+      </w:r>
+    </w:p>
+    <w:p>
+      <w:r>
+        <w:t>| 1016 | 24.997 |</w:t>
+      </w:r>
+    </w:p>
+    <w:p>
+      <w:r>
+        <w:t>| 1012 | 25.224 |</w:t>
+      </w:r>
+    </w:p>
+    <w:p>
+      <w:r>
+        <w:t>| 1008 | 25.832 |</w:t>
+      </w:r>
+    </w:p>
+    <w:p>
+      <w:r>
+        <w:t>| 1004 | 26.971 |</w:t>
+      </w:r>
+    </w:p>
+    <w:p>
+      <w:r>
+        <w:t>| 1406 | 27.742 |</w:t>
+      </w:r>
+    </w:p>
+    <w:p>
+      <w:r>
+        <w:t>| 1402 | 28.407 |</w:t>
+      </w:r>
+    </w:p>
+    <w:p>
+      <w:r>
+        <w:t>| 1514 | 29.162 |</w:t>
+      </w:r>
+    </w:p>
+    <w:p>
+      <w:r>
+        <w:t>Nota sobre la Vía 2: Al ser el trayecto de vuelta, las señales se encuentran en orden decreciente de PK si miramos hacia Barcelona, pero he mantenido la estructura de tu tabla para que sea fácil de cruzar con tus datos originales.</w:t>
       </w:r>
     </w:p>
     <w:sectPr>

</xml_diff>